<commit_message>
Docx writer: APA caption shape (bold label paragraph, italic title)
The caption supplement ("Table 9" / "Figure 9") becomes its own bold
paragraph before the caption body, and the caption body's first
paragraph (the title) is italicized, matching APA caption layout
(number and title on separate lines above the table or figure). The
label keeps its bookmark span and SEQ field, with the field run's
bold set directly (raw XML bypasses the run-property environment),
and a marked caption's label paragraph takes the mark span, so
highlighted captions still pen through.

Lab house style for the reference stock; not for upstream.
</commit_message>
<xml_diff>
--- a/test/docx/golden/caption_custom_style.docx
+++ b/test/docx/golden/caption_custom_style.docx
@@ -4,20 +4,36 @@
   <w:body>
     <w:p>
       <w:pPr>
-        <w:pStyle w:val="TestStyle"/>
+        <w:pStyle w:val="TableCaption"/>
       </w:pPr>
       <w:bookmarkStart w:id="9" w:name="_table1"/>
       <w:r>
+        <w:rPr>
+          <w:b/>
+          <w:bCs/>
+        </w:rPr>
         <w:t xml:space="preserve">Table </w:t>
       </w:r>
       <w:fldSimple w:instr="SEQ Table \* ARABIC ">
         <w:r>
+          <w:rPr>
+            <w:b/>
+          </w:rPr>
           <w:t>1</w:t>
         </w:r>
       </w:fldSimple>
       <w:bookmarkEnd w:id="9"/>
+    </w:p>
+    <w:p>
+      <w:pPr>
+        <w:pStyle w:val="TestStyle"/>
+      </w:pPr>
       <w:r>
-        <w:t xml:space="preserve">: custom caption</w:t>
+        <w:rPr>
+          <w:i/>
+          <w:iCs/>
+        </w:rPr>
+        <w:t xml:space="preserve">custom caption</w:t>
       </w:r>
     </w:p>
     <w:tbl>
@@ -51,16 +67,32 @@
       </w:pPr>
       <w:bookmarkStart w:id="10" w:name="_table2"/>
       <w:r>
+        <w:rPr>
+          <w:b/>
+          <w:bCs/>
+        </w:rPr>
         <w:t xml:space="preserve">Table </w:t>
       </w:r>
       <w:fldSimple w:instr="SEQ Table \* ARABIC ">
         <w:r>
+          <w:rPr>
+            <w:b/>
+          </w:rPr>
           <w:t>2</w:t>
         </w:r>
       </w:fldSimple>
       <w:bookmarkEnd w:id="10"/>
+    </w:p>
+    <w:p>
+      <w:pPr>
+        <w:pStyle w:val="TableCaption"/>
+      </w:pPr>
       <w:r>
-        <w:t xml:space="preserve">: plain caption</w:t>
+        <w:rPr>
+          <w:i/>
+          <w:iCs/>
+        </w:rPr>
+        <w:t xml:space="preserve">plain caption</w:t>
       </w:r>
     </w:p>
     <w:tbl>
@@ -114,20 +146,36 @@
     </w:tbl>
     <w:p>
       <w:pPr>
-        <w:pStyle w:val="FigStyle"/>
+        <w:pStyle w:val="ImageCaption"/>
       </w:pPr>
       <w:bookmarkStart w:id="11" w:name="_ref_fig1"/>
       <w:r>
+        <w:rPr>
+          <w:b/>
+          <w:bCs/>
+        </w:rPr>
         <w:t xml:space="preserve">Figure </w:t>
       </w:r>
       <w:fldSimple w:instr="SEQ Figure \* ARABIC ">
         <w:r>
+          <w:rPr>
+            <w:b/>
+          </w:rPr>
           <w:t>1</w:t>
         </w:r>
       </w:fldSimple>
       <w:bookmarkEnd w:id="11"/>
+    </w:p>
+    <w:p>
+      <w:pPr>
+        <w:pStyle w:val="FigStyle"/>
+      </w:pPr>
       <w:r>
-        <w:t xml:space="preserve">: fig cap</w:t>
+        <w:rPr>
+          <w:i/>
+          <w:iCs/>
+        </w:rPr>
+        <w:t xml:space="preserve">fig cap</w:t>
       </w:r>
     </w:p>
     <w:sectPr>

</xml_diff>